<commit_message>
feat: implementar fuente operacional de Compras (schema, seed, validaciones y ERD corregido)
</commit_message>
<xml_diff>
--- a/docs/modelos-logicos-erd/compras/Modelo_Logico_ERD_Compras_v0_1_Industrias_ABC.docx
+++ b/docs/modelos-logicos-erd/compras/Modelo_Logico_ERD_Compras_v0_1_Industrias_ABC.docx
@@ -1036,7 +1036,10 @@
         <w:rPr/>
       </w:pPr>
       <w:r>
-        <w:t>El Modelo Lógico materializa las diez entidades del Modelo Conceptual de Compras en diez tablas relacionales y sus vínculos. Se conserva el alcance del IDF v0.2: gestión de proveedores e insumos, emisión de órdenes de compra con su detalle por insumo y montos, imputación a centro de costo y comprador, y registro de recepciones con cantidades recibidas y rechazadas a nivel de línea. Las tablas areas y centros_costo, además de los catálogos de proveedores e insumos cuando corresponda, podrán poblarse tomando como referencia el Universo Empresarial Master v0.2. Las tablas compradores y categorias_insumo serán catálogos propios del Sistema de Compras, construidos de forma coherente con los datos de referencia disponibles. Todas las tablas se mantienen locales al sistema, sin claves físicas compartidas con otras bases.</w:t>
+        <w:rPr>
+          <w:rtl w:val="0"/>
+        </w:rPr>
+        <w:t xml:space="preserve">El Modelo Lógico materializa las diez entidades del Modelo Conceptual de Compras en diez tablas relacionales y sus vínculos. Se conserva el alcance del IDF v0.2: gestión de proveedores e insumos, emisión de órdenes de compra con su detalle por insumo y montos, imputación a centro de costo y comprador, y registro de recepciones con cantidades recibidas y rechazadas a nivel de línea. Las tablas areas y centros_costo, además de los catálogos de proveedores e insumos cuando corresponda, podrán poblarse tomando como referencia el Universo Empresarial Master v0.2. Las tablas compradores y categorias_insumo serán catálogos propios del Sistema de Compras, construidos de forma coherente con los datos de referencia disponibles. Todas las tablas se mantienen locales al sistema, sin claves físicas compartidas con otras bases.</w:t>
       </w:r>
     </w:p>
     <w:p>
@@ -1086,7 +1089,10 @@
         <w:rPr/>
       </w:pPr>
       <w:r>
-        <w:t>Claves subrogadas. Cada tabla usa una clave primaria lógica de tipo INTEGER; las claves naturales (RUT, número de OC y códigos) se protegen con UNIQUE. El mecanismo físico de autogeneración de identificadores se definirá posteriormente en schema.sql para PostgreSQL.</w:t>
+        <w:rPr>
+          <w:rtl w:val="0"/>
+        </w:rPr>
+        <w:t xml:space="preserve">Claves subrogadas. Cada tabla usa una clave primaria lógica de tipo INTEGER; las claves naturales (RUT, número de OC y códigos) se protegen con UNIQUE. El mecanismo físico de autogeneración de identificadores se definirá posteriormente en schema.sql para PostgreSQL.</w:t>
       </w:r>
     </w:p>
     <w:p>
@@ -1113,7 +1119,10 @@
         <w:rPr/>
       </w:pPr>
       <w:r>
-        <w:t>Tipos de datos. Identificadores INTEGER; textos VARCHAR(n); fechas DATE; importes y cantidades NUMERIC(p,s) para evitar errores de redondeo; moneda CHAR(3).</w:t>
+        <w:rPr>
+          <w:rtl w:val="0"/>
+        </w:rPr>
+        <w:t xml:space="preserve">Tipos de datos. Identificadores INTEGER; textos VARCHAR(n); fechas DATE; importes y cantidades NUMERIC(p,s) para evitar errores de redondeo; moneda CHAR(3).</w:t>
       </w:r>
     </w:p>
     <w:p>
@@ -1140,7 +1149,10 @@
         <w:rPr/>
       </w:pPr>
       <w:r>
-        <w:t>Dominios. Los estados se acotan con restricciones CHECK. La moneda utiliza código de tres caracteres y, para los datos iniciales del proyecto, se consideran CLP, USD y EUR como conjunto operativo; esta selección corresponde a una decisión del proyecto y podrá ampliarse en la implementación física.</w:t>
+        <w:rPr>
+          <w:rtl w:val="0"/>
+        </w:rPr>
+        <w:t xml:space="preserve">Dominios. Los estados se acotan con restricciones CHECK. La moneda utiliza código de tres caracteres y, para los datos iniciales del proyecto, se consideran CLP, USD y EUR como conjunto operativo; esta selección corresponde a una decisión del proyecto y podrá ampliarse en la implementación física.</w:t>
       </w:r>
     </w:p>
     <w:p>
@@ -1585,9 +1597,14 @@
             <w:vAlign w:val="center"/>
           </w:tcPr>
           <w:p>
-            <w:r/>
-            <w:r>
-              <w:t>INTEGER</w:t>
+            <w:pPr>
+              <w:rPr/>
+            </w:pPr>
+            <w:r>
+              <w:rPr>
+                <w:rtl w:val="0"/>
+              </w:rPr>
+              <w:t xml:space="preserve">INTEGER</w:t>
             </w:r>
           </w:p>
         </w:tc>
@@ -2372,9 +2389,14 @@
             <w:vAlign w:val="center"/>
           </w:tcPr>
           <w:p>
-            <w:r/>
-            <w:r>
-              <w:t>INTEGER</w:t>
+            <w:pPr>
+              <w:rPr/>
+            </w:pPr>
+            <w:r>
+              <w:rPr>
+                <w:rtl w:val="0"/>
+              </w:rPr>
+              <w:t xml:space="preserve">INTEGER</w:t>
             </w:r>
           </w:p>
         </w:tc>
@@ -3515,9 +3537,14 @@
             <w:vAlign w:val="center"/>
           </w:tcPr>
           <w:p>
-            <w:r/>
-            <w:r>
-              <w:t>INTEGER</w:t>
+            <w:pPr>
+              <w:rPr/>
+            </w:pPr>
+            <w:r>
+              <w:rPr>
+                <w:rtl w:val="0"/>
+              </w:rPr>
+              <w:t xml:space="preserve">INTEGER</w:t>
             </w:r>
           </w:p>
         </w:tc>
@@ -4310,7 +4337,7 @@
                 <w:szCs w:val="19"/>
                 <w:rtl w:val="0"/>
               </w:rPr>
-              <w:t xml:space="preserve">DEFAULT 'ACTIVO'; CHECK dominio</w:t>
+              <w:t xml:space="preserve">DEFAULT 'ACTIVO'; CHECK ∈ {ACTIVO, INACTIVO}</w:t>
             </w:r>
             <w:r>
               <w:rPr>
@@ -4658,9 +4685,14 @@
             <w:vAlign w:val="center"/>
           </w:tcPr>
           <w:p>
-            <w:r/>
-            <w:r>
-              <w:t>INTEGER</w:t>
+            <w:pPr>
+              <w:rPr/>
+            </w:pPr>
+            <w:r>
+              <w:rPr>
+                <w:rtl w:val="0"/>
+              </w:rPr>
+              <w:t xml:space="preserve">INTEGER</w:t>
             </w:r>
           </w:p>
         </w:tc>
@@ -5987,7 +6019,7 @@
                 <w:szCs w:val="19"/>
                 <w:rtl w:val="0"/>
               </w:rPr>
-              <w:t xml:space="preserve">DEFAULT 'ACTIVO'; CHECK dominio</w:t>
+              <w:t xml:space="preserve">DEFAULT 'ACTIVO'; CHECK ∈ {ACTIVO, INACTIVO}</w:t>
             </w:r>
             <w:r>
               <w:rPr>
@@ -6335,9 +6367,14 @@
             <w:vAlign w:val="center"/>
           </w:tcPr>
           <w:p>
-            <w:r/>
-            <w:r>
-              <w:t>INTEGER</w:t>
+            <w:pPr>
+              <w:rPr/>
+            </w:pPr>
+            <w:r>
+              <w:rPr>
+                <w:rtl w:val="0"/>
+              </w:rPr>
+              <w:t xml:space="preserve">INTEGER</w:t>
             </w:r>
           </w:p>
         </w:tc>
@@ -7122,9 +7159,14 @@
             <w:vAlign w:val="center"/>
           </w:tcPr>
           <w:p>
-            <w:r/>
-            <w:r>
-              <w:t>INTEGER</w:t>
+            <w:pPr>
+              <w:rPr/>
+            </w:pPr>
+            <w:r>
+              <w:rPr>
+                <w:rtl w:val="0"/>
+              </w:rPr>
+              <w:t xml:space="preserve">INTEGER</w:t>
             </w:r>
           </w:p>
         </w:tc>
@@ -8273,7 +8315,7 @@
                 <w:szCs w:val="19"/>
                 <w:rtl w:val="0"/>
               </w:rPr>
-              <w:t xml:space="preserve">DEFAULT 'ACTIVO'; CHECK dominio</w:t>
+              <w:t xml:space="preserve">DEFAULT 'ACTIVO'; CHECK ∈ {ACTIVO, INACTIVO}</w:t>
             </w:r>
             <w:r>
               <w:rPr>
@@ -8621,9 +8663,14 @@
             <w:vAlign w:val="center"/>
           </w:tcPr>
           <w:p>
-            <w:r/>
-            <w:r>
-              <w:t>INTEGER</w:t>
+            <w:pPr>
+              <w:rPr/>
+            </w:pPr>
+            <w:r>
+              <w:rPr>
+                <w:rtl w:val="0"/>
+              </w:rPr>
+              <w:t xml:space="preserve">INTEGER</w:t>
             </w:r>
           </w:p>
         </w:tc>
@@ -9950,7 +9997,7 @@
                 <w:szCs w:val="19"/>
                 <w:rtl w:val="0"/>
               </w:rPr>
-              <w:t xml:space="preserve">DEFAULT 'EMITIDA'; CHECK dominio</w:t>
+              <w:t xml:space="preserve">DEFAULT 'EMITIDA'; CHECK ∈ {EMITIDA, PARCIAL, RECIBIDA, CERRADA, ANULADA}</w:t>
             </w:r>
             <w:r>
               <w:rPr>
@@ -11010,9 +11057,14 @@
             <w:vAlign w:val="center"/>
           </w:tcPr>
           <w:p>
-            <w:r/>
-            <w:r>
-              <w:t>INTEGER</w:t>
+            <w:pPr>
+              <w:rPr/>
+            </w:pPr>
+            <w:r>
+              <w:rPr>
+                <w:rtl w:val="0"/>
+              </w:rPr>
+              <w:t xml:space="preserve">INTEGER</w:t>
             </w:r>
           </w:p>
         </w:tc>
@@ -11254,9 +11306,15 @@
             <w:vAlign w:val="center"/>
           </w:tcPr>
           <w:p>
-            <w:r/>
-            <w:r>
-              <w:t>FK → ordenes_compra · ON DELETE RESTRICT</w:t>
+            <w:pPr>
+              <w:rPr/>
+            </w:pPr>
+            <w:r>
+              <w:rPr>
+                <w:rFonts w:ascii="Cardo" w:cs="Cardo" w:eastAsia="Cardo" w:hAnsi="Cardo"/>
+                <w:rtl w:val="0"/>
+              </w:rPr>
+              <w:t xml:space="preserve">FK → ordenes_compra · ON DELETE RESTRICT</w:t>
             </w:r>
           </w:p>
         </w:tc>
@@ -12124,18 +12182,29 @@
             <w:vAlign w:val="center"/>
           </w:tcPr>
           <w:p>
-            <w:r/>
-            <w:r>
-              <w:t>CHECK ≥ 0</w:t>
+            <w:pPr>
+              <w:rPr/>
+            </w:pPr>
+            <w:r>
+              <w:rPr>
+                <w:rFonts w:ascii="Gungsuh" w:cs="Gungsuh" w:eastAsia="Gungsuh" w:hAnsi="Gungsuh"/>
+                <w:rtl w:val="0"/>
+              </w:rPr>
+              <w:t xml:space="preserve">CHECK ≥ 0</w:t>
             </w:r>
           </w:p>
         </w:tc>
       </w:tr>
     </w:tbl>
     <w:p>
-      <w:pPr/>
+      <w:pPr>
+        <w:rPr/>
+      </w:pPr>
       <w:r>
-        <w:t>Restricción compuesta de tabla: UNIQUE (oc_id, insumo_id). En esta versión, un mismo insumo no podrá aparecer en dos líneas distintas de una misma orden de compra.</w:t>
+        <w:rPr>
+          <w:rtl w:val="0"/>
+        </w:rPr>
+        <w:t xml:space="preserve">Restricción compuesta de tabla: UNIQUE (oc_id, insumo_id). En esta versión, un mismo insumo no podrá aparecer en dos líneas distintas de una misma orden de compra.</w:t>
       </w:r>
     </w:p>
     <w:p>
@@ -12475,9 +12544,14 @@
             <w:vAlign w:val="center"/>
           </w:tcPr>
           <w:p>
-            <w:r/>
-            <w:r>
-              <w:t>INTEGER</w:t>
+            <w:pPr>
+              <w:rPr/>
+            </w:pPr>
+            <w:r>
+              <w:rPr>
+                <w:rtl w:val="0"/>
+              </w:rPr>
+              <w:t xml:space="preserve">INTEGER</w:t>
             </w:r>
           </w:p>
         </w:tc>
@@ -13092,7 +13166,7 @@
                 <w:szCs w:val="19"/>
                 <w:rtl w:val="0"/>
               </w:rPr>
-              <w:t xml:space="preserve">DEFAULT 'REGISTRADA'; CHECK dominio</w:t>
+              <w:t xml:space="preserve">DEFAULT 'REGISTRADA'; CHECK ∈ {REGISTRADA, CONFORME, CON_DIFERENCIAS, ANULADA}</w:t>
             </w:r>
             <w:r>
               <w:rPr>
@@ -13440,9 +13514,14 @@
             <w:vAlign w:val="center"/>
           </w:tcPr>
           <w:p>
-            <w:r/>
-            <w:r>
-              <w:t>INTEGER</w:t>
+            <w:pPr>
+              <w:rPr/>
+            </w:pPr>
+            <w:r>
+              <w:rPr>
+                <w:rtl w:val="0"/>
+              </w:rPr>
+              <w:t xml:space="preserve">INTEGER</w:t>
             </w:r>
           </w:p>
         </w:tc>
@@ -13684,9 +13763,15 @@
             <w:vAlign w:val="center"/>
           </w:tcPr>
           <w:p>
-            <w:r/>
-            <w:r>
-              <w:t>FK → recepciones · ON DELETE RESTRICT</w:t>
+            <w:pPr>
+              <w:rPr/>
+            </w:pPr>
+            <w:r>
+              <w:rPr>
+                <w:rFonts w:ascii="Cardo" w:cs="Cardo" w:eastAsia="Cardo" w:hAnsi="Cardo"/>
+                <w:rtl w:val="0"/>
+              </w:rPr>
+              <w:t xml:space="preserve">FK → recepciones · ON DELETE RESTRICT</w:t>
             </w:r>
           </w:p>
         </w:tc>
@@ -14376,18 +14461,29 @@
             <w:vAlign w:val="center"/>
           </w:tcPr>
           <w:p>
-            <w:r/>
-            <w:r>
-              <w:t>CHECK ∈ {OK, PARCIAL, RECHAZADO}</w:t>
+            <w:pPr>
+              <w:rPr/>
+            </w:pPr>
+            <w:r>
+              <w:rPr>
+                <w:rFonts w:ascii="Gungsuh" w:cs="Gungsuh" w:eastAsia="Gungsuh" w:hAnsi="Gungsuh"/>
+                <w:rtl w:val="0"/>
+              </w:rPr>
+              <w:t xml:space="preserve">CHECK ∈ {OK, PARCIAL, RECHAZADO}</w:t>
             </w:r>
           </w:p>
         </w:tc>
       </w:tr>
     </w:tbl>
     <w:p>
-      <w:pPr/>
+      <w:pPr>
+        <w:rPr/>
+      </w:pPr>
       <w:r>
-        <w:t>Restricción compuesta de tabla: UNIQUE (recepcion_id, detalle_id). Una misma línea de orden solo podrá aparecer una vez dentro de una recepción específica.</w:t>
+        <w:rPr>
+          <w:rtl w:val="0"/>
+        </w:rPr>
+        <w:t xml:space="preserve">Restricción compuesta de tabla: UNIQUE (recepcion_id, detalle_id). Una misma línea de orden solo podrá aparecer una vez dentro de una recepción específica.</w:t>
       </w:r>
     </w:p>
     <w:p>
@@ -14396,7 +14492,10 @@
         <w:rPr/>
       </w:pPr>
       <w:r>
-        <w:t>Las relaciones son de uno a muchos (N:1 desde la tabla hija), salvo Área–Centro de costo, que es 1:1 (area_id con restricción UNIQUE). Para preservar la trazabilidad histórica de órdenes y recepciones, las relaciones usan RESTRICT frente a eliminaciones físicas. Las bajas o anulaciones operacionales deberán representarse preferentemente mediante estados.</w:t>
+        <w:rPr>
+          <w:rtl w:val="0"/>
+        </w:rPr>
+        <w:t xml:space="preserve">Las relaciones son de uno a muchos (N:1 desde la tabla hija), salvo Área–Centro de costo, que es 1:1 (area_id con restricción UNIQUE). Para preservar la trazabilidad histórica de órdenes y recepciones, las relaciones usan RESTRICT frente a eliminaciones físicas. Las bajas o anulaciones operacionales deberán representarse preferentemente mediante estados.</w:t>
       </w:r>
     </w:p>
     <w:p>
@@ -14440,7 +14539,7 @@
           <w:szCs w:val="21"/>
           <w:rtl w:val="0"/>
         </w:rPr>
-        <w:t xml:space="preserve">Las relaciones son de uno a muchos (N:1 desde la tabla hija), salvo Área–Centro de costo, que es 1:1 (area_id con restricción UNIQUE). El borrado en cascada se limita a los detalles respecto de su cabecera; el resto usa RESTRICT para proteger los datos de referencia.</w:t>
+        <w:t xml:space="preserve">Las relaciones son de uno a muchos (N:1 desde la tabla hija), salvo Área–Centro de costo, que es 1:1 (area_id con restricción UNIQUE). Todas las relaciones utilizan RESTRICT en ON DELETE para proteger los datos de referencia y preservar la trazabilidad histórica; no se emplea borrado en cascada.</w:t>
       </w:r>
       <w:r>
         <w:rPr>
@@ -15532,9 +15631,14 @@
             <w:vAlign w:val="center"/>
           </w:tcPr>
           <w:p>
-            <w:r/>
-            <w:r>
-              <w:t>RESTRICT</w:t>
+            <w:pPr>
+              <w:rPr/>
+            </w:pPr>
+            <w:r>
+              <w:rPr>
+                <w:rtl w:val="0"/>
+              </w:rPr>
+              <w:t xml:space="preserve">RESTRICT</w:t>
             </w:r>
           </w:p>
         </w:tc>
@@ -15917,9 +16021,14 @@
             <w:vAlign w:val="center"/>
           </w:tcPr>
           <w:p>
-            <w:r/>
-            <w:r>
-              <w:t>RESTRICT</w:t>
+            <w:pPr>
+              <w:rPr/>
+            </w:pPr>
+            <w:r>
+              <w:rPr>
+                <w:rtl w:val="0"/>
+              </w:rPr>
+              <w:t xml:space="preserve">RESTRICT</w:t>
             </w:r>
           </w:p>
         </w:tc>
@@ -16081,16 +16190,6 @@
         <w:rPr>
           <w:rtl w:val="0"/>
         </w:rPr>
-      </w:r>
-    </w:p>
-    <w:p>
-      <w:pPr>
-        <w:spacing w:after="120" w:line="276" w:lineRule="auto"/>
-        <w:jc w:val="both"/>
-        <w:rPr/>
-      </w:pPr>
-      <w:r>
-        <w:t>Además de los índices automáticos de PK y UNIQUE, se proponen los siguientes para soportar los análisis definidos por el Trabajo v2 (compras por período, proveedor, insumo y centro de costo; cumplimiento y diferencias de recepción). En schema.sql se revisará que los índices adicionales no dupliquen índices ya cubiertos por restricciones PK o UNIQUE.</w:t>
       </w:r>
     </w:p>
     <w:tbl>
@@ -16695,32 +16794,42 @@
             <w:vAlign w:val="center"/>
           </w:tcPr>
           <w:p>
-            <w:r/>
-            <w:r>
-              <w:t>La suma acumulada de cantidad_recibida + cantidad_rechazada de todos los detalles de recepción asociados a una misma línea no puede superar la cantidad solicitada</w:t>
-            </w:r>
-          </w:p>
-        </w:tc>
-        <w:tc>
-          <w:tcPr>
-            <w:tcBorders>
-              <w:top w:color="9fb0cc" w:space="0" w:sz="4" w:val="single"/>
-              <w:left w:color="9fb0cc" w:space="0" w:sz="4" w:val="single"/>
-              <w:bottom w:color="9fb0cc" w:space="0" w:sz="4" w:val="single"/>
-              <w:right w:color="9fb0cc" w:space="0" w:sz="4" w:val="single"/>
-            </w:tcBorders>
-            <w:tcMar>
-              <w:top w:w="40.0" w:type="dxa"/>
-              <w:left w:w="100.0" w:type="dxa"/>
-              <w:bottom w:w="40.0" w:type="dxa"/>
-              <w:right w:w="100.0" w:type="dxa"/>
-            </w:tcMar>
-            <w:vAlign w:val="center"/>
-          </w:tcPr>
-          <w:p>
-            <w:r/>
-            <w:r>
-              <w:t>Trigger / validación entre tablas con agregación acumulada</w:t>
+            <w:pPr>
+              <w:rPr/>
+            </w:pPr>
+            <w:r>
+              <w:rPr>
+                <w:rtl w:val="0"/>
+              </w:rPr>
+              <w:t xml:space="preserve">La suma acumulada de cantidad_recibida + cantidad_rechazada de todos los detalles de recepción asociados a una misma línea no puede superar la cantidad solicitada</w:t>
+            </w:r>
+          </w:p>
+        </w:tc>
+        <w:tc>
+          <w:tcPr>
+            <w:tcBorders>
+              <w:top w:color="9fb0cc" w:space="0" w:sz="4" w:val="single"/>
+              <w:left w:color="9fb0cc" w:space="0" w:sz="4" w:val="single"/>
+              <w:bottom w:color="9fb0cc" w:space="0" w:sz="4" w:val="single"/>
+              <w:right w:color="9fb0cc" w:space="0" w:sz="4" w:val="single"/>
+            </w:tcBorders>
+            <w:tcMar>
+              <w:top w:w="40.0" w:type="dxa"/>
+              <w:left w:w="100.0" w:type="dxa"/>
+              <w:bottom w:w="40.0" w:type="dxa"/>
+              <w:right w:w="100.0" w:type="dxa"/>
+            </w:tcMar>
+            <w:vAlign w:val="center"/>
+          </w:tcPr>
+          <w:p>
+            <w:pPr>
+              <w:rPr/>
+            </w:pPr>
+            <w:r>
+              <w:rPr>
+                <w:rtl w:val="0"/>
+              </w:rPr>
+              <w:t xml:space="preserve">Trigger / validación entre tablas con agregación acumulada</w:t>
             </w:r>
           </w:p>
         </w:tc>
@@ -16910,25 +17019,35 @@
         </w:tc>
       </w:tr>
       <w:tr>
-        <w:tc>
-          <w:tcPr>
-            <w:tcW w:type="dxa" w:w="4680"/>
-          </w:tcPr>
-          <w:p>
-            <w:r/>
-            <w:r>
-              <w:t>Cada detalle_recepcion debe referenciar una línea de detalle_orden_compra perteneciente a la misma orden de compra asociada a la recepción</w:t>
-            </w:r>
-          </w:p>
-        </w:tc>
-        <w:tc>
-          <w:tcPr>
-            <w:tcW w:type="dxa" w:w="4680"/>
-          </w:tcPr>
-          <w:p>
-            <w:r/>
-            <w:r>
-              <w:t>Trigger / validación entre tablas</w:t>
+        <w:trPr>
+          <w:cantSplit w:val="0"/>
+          <w:tblHeader w:val="0"/>
+        </w:trPr>
+        <w:tc>
+          <w:tcPr/>
+          <w:p>
+            <w:pPr>
+              <w:rPr/>
+            </w:pPr>
+            <w:r>
+              <w:rPr>
+                <w:rtl w:val="0"/>
+              </w:rPr>
+              <w:t xml:space="preserve">Cada detalle_recepcion debe referenciar una línea de detalle_orden_compra perteneciente a la misma orden de compra asociada a la recepción</w:t>
+            </w:r>
+          </w:p>
+        </w:tc>
+        <w:tc>
+          <w:tcPr/>
+          <w:p>
+            <w:pPr>
+              <w:rPr/>
+            </w:pPr>
+            <w:r>
+              <w:rPr>
+                <w:rtl w:val="0"/>
+              </w:rPr>
+              <w:t xml:space="preserve">Trigger / validación entre tablas</w:t>
             </w:r>
           </w:p>
         </w:tc>
@@ -16964,7 +17083,10 @@
         <w:rPr/>
       </w:pPr>
       <w:r>
-        <w:t>El esquema se diseña siguiendo criterios de Tercera Forma Normal (3NF): cada tabla tiene una clave primaria única, los atributos no clave dependen de la clave correspondiente y se evitan dependencias transitivas. La categoría del insumo se separa en categorias_insumo y las áreas se separan de los centros de costo. Como denormalización controlada, se almacenan montos derivados —subtotal de línea y subtotal/total de la orden— por trazabilidad operacional y rendimiento; su consistencia deberá garantizarse mediante reglas de negocio en la implementación física.</w:t>
+        <w:rPr>
+          <w:rtl w:val="0"/>
+        </w:rPr>
+        <w:t xml:space="preserve">Además de los índices automáticos de PK y UNIQUE, se proponen los siguientes para soportar los análisis definidos por el Trabajo v2 (compras por período, proveedor, insumo y centro de costo; cumplimiento y diferencias de recepción). En schema.sql se revisará que los índices adicionales no dupliquen índices ya cubiertos por restricciones PK o UNIQUE.</w:t>
       </w:r>
     </w:p>
     <w:tbl>
@@ -18320,17 +18442,67 @@
     </w:p>
     <w:p>
       <w:pPr>
+        <w:spacing w:after="120" w:before="120" w:lineRule="auto"/>
+        <w:jc w:val="center"/>
+        <w:rPr/>
+      </w:pPr>
+      <w:r>
+        <w:rPr/>
+        <w:drawing>
+          <wp:inline distB="0" distT="0" distL="0" distR="0">
+            <wp:extent cx="5760720" cy="2741056"/>
+            <wp:effectExtent b="0" l="0" r="0" t="0"/>
+            <wp:docPr id="2" name="image2.png"/>
+            <a:graphic>
+              <a:graphicData uri="http://schemas.openxmlformats.org/drawingml/2006/picture">
+                <pic:pic>
+                  <pic:nvPicPr>
+                    <pic:cNvPr id="0" name="image2.png"/>
+                    <pic:cNvPicPr preferRelativeResize="0"/>
+                  </pic:nvPicPr>
+                  <pic:blipFill>
+                    <a:blip r:embed="rId8"/>
+                    <a:srcRect b="0" l="0" r="0" t="0"/>
+                    <a:stretch>
+                      <a:fillRect/>
+                    </a:stretch>
+                  </pic:blipFill>
+                  <pic:spPr>
+                    <a:xfrm>
+                      <a:off x="0" y="0"/>
+                      <a:ext cx="5760720" cy="2741056"/>
+                    </a:xfrm>
+                    <a:prstGeom prst="rect"/>
+                    <a:ln/>
+                  </pic:spPr>
+                </pic:pic>
+              </a:graphicData>
+            </a:graphic>
+          </wp:inline>
+        </w:drawing>
+      </w:r>
+      <w:r>
+        <w:rPr>
+          <w:rtl w:val="0"/>
+        </w:rPr>
+      </w:r>
+    </w:p>
+    <w:p>
+      <w:pPr>
         <w:jc w:val="center"/>
         <w:rPr/>
         <w:sectPr>
-          <w:footerReference r:id="rId8" w:type="default"/>
+          <w:footerReference r:id="rId9" w:type="default"/>
           <w:type w:val="nextPage"/>
           <w:pgSz w:h="12240" w:w="15840" w:orient="landscape"/>
           <w:pgMar w:bottom="720" w:top="900" w:left="720" w:right="720" w:header="708" w:footer="708"/>
         </w:sectPr>
       </w:pPr>
       <w:r>
-        <w:t>Tablas de referencia locales. areas y centros_costo, además de proveedores e insumos cuando corresponda, podrán poblarse tomando como referencia el Universo Master v0.2. compradores y categorias_insumo son catálogos propios del Sistema de Compras. Todas estas tablas permanecen locales y no se crean FK físicas hacia otras bases; la integración posterior se resolverá mediante homologación.</w:t>
+        <w:rPr>
+          <w:rtl w:val="0"/>
+        </w:rPr>
+        <w:t xml:space="preserve">Tablas de referencia locales. areas y centros_costo, además de proveedores e insumos cuando corresponda, podrán poblarse tomando como referencia el Universo Master v0.2. compradores y categorias_insumo son catálogos propios del Sistema de Compras. Todas estas tablas permanecen locales y no se crean FK físicas hacia otras bases; la integración posterior se resolverá mediante homologación.</w:t>
       </w:r>
     </w:p>
     <w:p>
@@ -18396,7 +18568,7 @@
           <w:vertAlign w:val="baseline"/>
           <w:rtl w:val="0"/>
         </w:rPr>
-        <w:t xml:space="preserve">Tablas de referencia locales. areas, centros_costo, compradores y categorias_insumo se mantienen dentro del sistema de Compras y se poblarán por seed desde el Universo Master; no se crean FK físicas hacia otras bases (la integración se resolverá por homologación).</w:t>
+        <w:t xml:space="preserve">Tablas de referencia locales. areas y centros_costo, además de proveedores e insumos cuando corresponda, podrán poblarse tomando como referencia el Universo Empresarial Master v0.2. compradores y categorias_insumo serán catálogos propios del Sistema de Compras, construidos de forma coherente con los datos de referencia disponibles. Todas estas tablas permanecen locales y no se crean FK físicas hacia otras bases; la integración posterior se resolverá mediante homologación.</w:t>
       </w:r>
       <w:r>
         <w:rPr>
@@ -18492,109 +18664,7 @@
           <w:vertAlign w:val="baseline"/>
           <w:rtl w:val="0"/>
         </w:rPr>
-        <w:t xml:space="preserve">Comprador homologable con RRHH. compradores no tiene FK hacia RRHH; conserva su propio identificador y podrá homologarse con empleado_id en la fase de integración.</w:t>
-      </w:r>
-      <w:r>
-        <w:rPr>
-          <w:rtl w:val="0"/>
-        </w:rPr>
-      </w:r>
-    </w:p>
-    <w:p>
-      <w:pPr>
-        <w:keepNext w:val="0"/>
-        <w:keepLines w:val="0"/>
-        <w:pageBreakBefore w:val="0"/>
-        <w:widowControl w:val="1"/>
-        <w:numPr>
-          <w:ilvl w:val="0"/>
-          <w:numId w:val="1"/>
-        </w:numPr>
-        <w:pBdr>
-          <w:top w:space="0" w:sz="0" w:val="nil"/>
-          <w:left w:space="0" w:sz="0" w:val="nil"/>
-          <w:bottom w:space="0" w:sz="0" w:val="nil"/>
-          <w:right w:space="0" w:sz="0" w:val="nil"/>
-          <w:between w:space="0" w:sz="0" w:val="nil"/>
-        </w:pBdr>
-        <w:shd w:fill="auto" w:val="clear"/>
-        <w:spacing w:after="90" w:before="0" w:line="270" w:lineRule="auto"/>
-        <w:ind w:left="720" w:right="0" w:hanging="360"/>
-        <w:jc w:val="both"/>
-        <w:rPr/>
-      </w:pPr>
-      <w:r>
-        <w:t>Moneda y tipo de cambio. Se registra la moneda por orden mediante un código de tres caracteres. Para los datos iniciales se consideran CLP, USD y EUR como conjunto operativo del proyecto; la conversión y el tipo de cambio se resolverán en la integración/ETL, fuera de esta fuente operacional.</w:t>
-      </w:r>
-    </w:p>
-    <w:p>
-      <w:pPr>
-        <w:keepNext w:val="0"/>
-        <w:keepLines w:val="0"/>
-        <w:pageBreakBefore w:val="0"/>
-        <w:widowControl w:val="1"/>
-        <w:numPr>
-          <w:ilvl w:val="0"/>
-          <w:numId w:val="1"/>
-        </w:numPr>
-        <w:pBdr>
-          <w:top w:space="0" w:sz="0" w:val="nil"/>
-          <w:left w:space="0" w:sz="0" w:val="nil"/>
-          <w:bottom w:space="0" w:sz="0" w:val="nil"/>
-          <w:right w:space="0" w:sz="0" w:val="nil"/>
-          <w:between w:space="0" w:sz="0" w:val="nil"/>
-        </w:pBdr>
-        <w:shd w:fill="auto" w:val="clear"/>
-        <w:spacing w:after="90" w:before="0" w:line="270" w:lineRule="auto"/>
-        <w:ind w:left="720" w:right="0" w:hanging="360"/>
-        <w:jc w:val="both"/>
-        <w:rPr/>
-      </w:pPr>
-      <w:r>
-        <w:t>Borrado y trazabilidad. Las relaciones transaccionales utilizan RESTRICT para evitar la eliminación accidental de órdenes, líneas, recepciones o detalles con valor histórico. Las anulaciones o bajas operacionales deberán representarse mediante estados, salvo procedimientos administrativos excepcionales definidos posteriormente.</w:t>
-      </w:r>
-    </w:p>
-    <w:p>
-      <w:pPr>
-        <w:keepNext w:val="0"/>
-        <w:keepLines w:val="0"/>
-        <w:pageBreakBefore w:val="0"/>
-        <w:widowControl w:val="1"/>
-        <w:numPr>
-          <w:ilvl w:val="0"/>
-          <w:numId w:val="1"/>
-        </w:numPr>
-        <w:pBdr>
-          <w:top w:space="0" w:sz="0" w:val="nil"/>
-          <w:left w:space="0" w:sz="0" w:val="nil"/>
-          <w:bottom w:space="0" w:sz="0" w:val="nil"/>
-          <w:right w:space="0" w:sz="0" w:val="nil"/>
-          <w:between w:space="0" w:sz="0" w:val="nil"/>
-        </w:pBdr>
-        <w:shd w:fill="auto" w:val="clear"/>
-        <w:spacing w:after="90" w:before="0" w:line="270" w:lineRule="auto"/>
-        <w:ind w:left="720" w:right="0" w:hanging="360"/>
-        <w:jc w:val="both"/>
-        <w:rPr/>
-      </w:pPr>
-      <w:r>
-        <w:rPr>
-          <w:rFonts w:ascii="Calibri" w:cs="Calibri" w:eastAsia="Calibri" w:hAnsi="Calibri"/>
-          <w:b w:val="0"/>
-          <w:bCs w:val="0"/>
-          <w:i w:val="0"/>
-          <w:iCs w:val="0"/>
-          <w:smallCaps w:val="0"/>
-          <w:strike w:val="0"/>
-          <w:color w:val="222222"/>
-          <w:sz w:val="21"/>
-          <w:szCs w:val="21"/>
-          <w:u w:val="none"/>
-          <w:shd w:fill="auto" w:val="clear"/>
-          <w:vertAlign w:val="baseline"/>
-          <w:rtl w:val="0"/>
-        </w:rPr>
-        <w:t xml:space="preserve">Moneda y tipo de cambio. Se registra la moneda por orden; la conversión y el tipo de cambio se resolverán en la integración/ETL, fuera de esta fuente operacional.</w:t>
+        <w:t xml:space="preserve">Comprador homologable con RRHH. compradores no tiene FK hacia RRHH; conserva su propio identificador y podrá homologarse posteriormente con el trabajador correspondiente de RRHH mediante las reglas de integración.</w:t>
       </w:r>
       <w:r>
         <w:rPr>
@@ -18627,27 +18697,39 @@
       </w:pPr>
       <w:r>
         <w:rPr>
-          <w:rFonts w:ascii="Calibri" w:cs="Calibri" w:eastAsia="Calibri" w:hAnsi="Calibri"/>
-          <w:b w:val="0"/>
-          <w:bCs w:val="0"/>
-          <w:i w:val="0"/>
-          <w:iCs w:val="0"/>
-          <w:smallCaps w:val="0"/>
-          <w:strike w:val="0"/>
-          <w:color w:val="222222"/>
-          <w:sz w:val="21"/>
-          <w:szCs w:val="21"/>
-          <w:u w:val="none"/>
-          <w:shd w:fill="auto" w:val="clear"/>
-          <w:vertAlign w:val="baseline"/>
           <w:rtl w:val="0"/>
         </w:rPr>
-        <w:t xml:space="preserve">Borrado. ON DELETE CASCADE solo de cada detalle respecto de su cabecera (detalle_orden_compra y detalle_recepcion); el resto RESTRICT.</w:t>
+        <w:t xml:space="preserve">Moneda y tipo de cambio. Se registra la moneda por orden mediante un código de tres caracteres. Para los datos iniciales se consideran CLP, USD y EUR como conjunto operativo del proyecto; la conversión y el tipo de cambio se resolverán en la integración/ETL, fuera de esta fuente operacional.</w:t>
       </w:r>
+    </w:p>
+    <w:p>
+      <w:pPr>
+        <w:keepNext w:val="0"/>
+        <w:keepLines w:val="0"/>
+        <w:pageBreakBefore w:val="0"/>
+        <w:widowControl w:val="1"/>
+        <w:numPr>
+          <w:ilvl w:val="0"/>
+          <w:numId w:val="1"/>
+        </w:numPr>
+        <w:pBdr>
+          <w:top w:space="0" w:sz="0" w:val="nil"/>
+          <w:left w:space="0" w:sz="0" w:val="nil"/>
+          <w:bottom w:space="0" w:sz="0" w:val="nil"/>
+          <w:right w:space="0" w:sz="0" w:val="nil"/>
+          <w:between w:space="0" w:sz="0" w:val="nil"/>
+        </w:pBdr>
+        <w:shd w:fill="auto" w:val="clear"/>
+        <w:spacing w:after="90" w:before="0" w:line="270" w:lineRule="auto"/>
+        <w:ind w:left="720" w:right="0" w:hanging="360"/>
+        <w:jc w:val="both"/>
+        <w:rPr/>
+      </w:pPr>
       <w:r>
         <w:rPr>
           <w:rtl w:val="0"/>
         </w:rPr>
+        <w:t xml:space="preserve">Borrado y trazabilidad. Las relaciones transaccionales utilizan RESTRICT para evitar la eliminación accidental de órdenes, líneas, recepciones o detalles con valor histórico. Las anulaciones o bajas operacionales deberán representarse mediante estados, salvo procedimientos administrativos excepcionales definidos posteriormente.</w:t>
       </w:r>
     </w:p>
     <w:p>
@@ -18656,7 +18738,21 @@
         <w:rPr/>
       </w:pPr>
       <w:r>
-        <w:t>El Modelo Lógico del Sistema Operacional de Compras y Abastecimiento queda definido con diez tablas diseñadas bajo criterios de 3NF, once claves foráneas con integridad referencial, restricciones de negocio e índices orientados a los análisis exigidos. El diseño conserva la trazabilidad con el Modelo Conceptual v0.1, el Trabajo v2 y el Universo Master v0.2, mantiene la independencia de la fuente y contempla validaciones acumuladas para las recepciones. Con esto existe base suficiente para avanzar a la implementación física.</w:t>
+        <w:rPr>
+          <w:rFonts w:ascii="Calibri" w:cs="Calibri" w:eastAsia="Calibri" w:hAnsi="Calibri"/>
+          <w:b w:val="1"/>
+          <w:bCs w:val="1"/>
+          <w:color w:val="1f3864"/>
+          <w:sz w:val="26"/>
+          <w:szCs w:val="26"/>
+          <w:rtl w:val="0"/>
+        </w:rPr>
+        <w:t xml:space="preserve">10.  Validación de trazabilidad</w:t>
+      </w:r>
+      <w:r>
+        <w:rPr>
+          <w:rtl w:val="0"/>
+        </w:rPr>
       </w:r>
     </w:p>
     <w:tbl>
@@ -19124,9 +19220,14 @@
             <w:vAlign w:val="center"/>
           </w:tcPr>
           <w:p>
-            <w:r/>
-            <w:r>
-              <w:t>Cumple. areas y centros_costo, además de proveedores e insumos cuando corresponda, podrán poblarse tomando como referencia el Universo Master v0.2. compradores y categorias_insumo se mantienen como catálogos propios del Sistema de Compras, sin unificar identificadores con otras fuentes.</w:t>
+            <w:pPr>
+              <w:rPr/>
+            </w:pPr>
+            <w:r>
+              <w:rPr>
+                <w:rtl w:val="0"/>
+              </w:rPr>
+              <w:t xml:space="preserve">Cumple. areas y centros_costo, además de proveedores e insumos cuando corresponda, podrán poblarse tomando como referencia el Universo Master v0.2. compradores y categorias_insumo se mantienen como catálogos propios del Sistema de Compras, sin unificar identificadores con otras fuentes.</w:t>
             </w:r>
           </w:p>
         </w:tc>
@@ -19138,28 +19239,16 @@
         <w:rPr/>
       </w:pPr>
       <w:r>
-        <w:t>Siguiente entregable interno: schema.sql del Sistema Operacional de Compras y Abastecimiento en PostgreSQL, seguido de seed.sql y validaciones.sql.</w:t>
-      </w:r>
-    </w:p>
-    <w:p>
-      <w:pPr>
-        <w:spacing w:after="120" w:line="276" w:lineRule="auto"/>
-        <w:jc w:val="both"/>
-        <w:rPr/>
-      </w:pPr>
-      <w:r>
         <w:rPr>
           <w:rFonts w:ascii="Calibri" w:cs="Calibri" w:eastAsia="Calibri" w:hAnsi="Calibri"/>
-          <w:b w:val="0"/>
-          <w:bCs w:val="0"/>
-          <w:i w:val="0"/>
-          <w:iCs w:val="0"/>
-          <w:color w:val="222222"/>
-          <w:sz w:val="21"/>
-          <w:szCs w:val="21"/>
+          <w:b w:val="1"/>
+          <w:bCs w:val="1"/>
+          <w:color w:val="1f3864"/>
+          <w:sz w:val="26"/>
+          <w:szCs w:val="26"/>
           <w:rtl w:val="0"/>
         </w:rPr>
-        <w:t xml:space="preserve">El Modelo Lógico del Sistema Operacional de Compras y Abastecimiento queda definido con diez tablas en 3NF, once claves foráneas con integridad referencial, restricciones de negocio (CHECK y triggers) e índices orientados a los análisis exigidos. El diseño conserva la trazabilidad con el Modelo Conceptual v0.1, el Trabajo v2 y el Universo Master v0.2, y mantiene la independencia de la fuente. Con esto existe base suficiente para construir el Modelo Físico.</w:t>
+        <w:t xml:space="preserve">11.  Síntesis y paso siguiente</w:t>
       </w:r>
       <w:r>
         <w:rPr>
@@ -19169,38 +19258,26 @@
     </w:p>
     <w:p>
       <w:pPr>
-        <w:spacing w:after="120" w:before="120" w:lineRule="auto"/>
-        <w:jc w:val="both"/>
+        <w:spacing w:after="120" w:before="260" w:lineRule="auto"/>
         <w:rPr/>
       </w:pPr>
       <w:r>
         <w:rPr>
-          <w:rFonts w:ascii="Calibri" w:cs="Calibri" w:eastAsia="Calibri" w:hAnsi="Calibri"/>
-          <w:b w:val="1"/>
-          <w:bCs w:val="1"/>
-          <w:color w:val="1f3864"/>
-          <w:sz w:val="21"/>
-          <w:szCs w:val="21"/>
           <w:rtl w:val="0"/>
         </w:rPr>
-        <w:t xml:space="preserve">Siguiente entregable interno: </w:t>
+        <w:t xml:space="preserve">El Modelo Lógico del Sistema Operacional de Compras y Abastecimiento queda definido con diez tablas diseñadas bajo criterios de 3NF, once claves foráneas con integridad referencial, restricciones de negocio e índices orientados a los análisis exigidos. El diseño conserva la trazabilidad con el Modelo Conceptual v0.1, el Trabajo v2 y el Universo Master v0.2, mantiene la independencia de la fuente y contempla validaciones acumuladas para las recepciones. Con esto existe base suficiente para avanzar a la implementación física.</w:t>
       </w:r>
-      <w:r>
-        <w:rPr>
-          <w:rFonts w:ascii="Calibri" w:cs="Calibri" w:eastAsia="Calibri" w:hAnsi="Calibri"/>
-          <w:i w:val="1"/>
-          <w:iCs w:val="1"/>
-          <w:color w:val="333333"/>
-          <w:sz w:val="21"/>
-          <w:szCs w:val="21"/>
-          <w:rtl w:val="0"/>
-        </w:rPr>
-        <w:t xml:space="preserve">Modelo Físico — script DDL de PostgreSQL (CREATE TABLE con claves, restricciones e índices) y datos seed limpios desde el Universo Master v0.2, para su construcción en pgAdmin.</w:t>
-      </w:r>
+    </w:p>
+    <w:p>
+      <w:pPr>
+        <w:spacing w:after="120" w:before="260" w:lineRule="auto"/>
+        <w:rPr/>
+      </w:pPr>
       <w:r>
         <w:rPr>
           <w:rtl w:val="0"/>
         </w:rPr>
+        <w:t xml:space="preserve">Siguiente entregable interno: schema.sql del Sistema Operacional de Compras y Abastecimiento en PostgreSQL, seguido de seed.sql y validaciones.sql.</w:t>
       </w:r>
     </w:p>
     <w:p>
@@ -19398,9 +19475,14 @@
             <w:vAlign w:val="center"/>
           </w:tcPr>
           <w:p>
-            <w:r/>
-            <w:r>
-              <w:t>Aprobado para implementación física / schema.sql</w:t>
+            <w:pPr>
+              <w:rPr/>
+            </w:pPr>
+            <w:r>
+              <w:rPr>
+                <w:rtl w:val="0"/>
+              </w:rPr>
+              <w:t xml:space="preserve">Aprobado para implementación física / schema.sql</w:t>
             </w:r>
           </w:p>
         </w:tc>
@@ -19471,9 +19553,14 @@
             <w:vAlign w:val="center"/>
           </w:tcPr>
           <w:p>
-            <w:r/>
-            <w:r>
-              <w:t>El Modelo Lógico traduce el conceptual aprobado a un esquema relacional consistente para PostgreSQL, con PK/FK, integridad referencial, restricciones de negocio, validación acumulada de recepciones y criterios de trazabilidad histórica. Las restricciones compuestas quedan separadas de las columnas y las referencias al Universo Master v0.2 se ajustan a los datos realmente disponibles.</w:t>
+            <w:pPr>
+              <w:rPr/>
+            </w:pPr>
+            <w:r>
+              <w:rPr>
+                <w:rtl w:val="0"/>
+              </w:rPr>
+              <w:t xml:space="preserve">El Modelo Lógico traduce el conceptual aprobado a un esquema relacional consistente para PostgreSQL, con PK/FK, integridad referencial, restricciones de negocio, validación acumulada de recepciones y criterios de trazabilidad histórica. Las restricciones compuestas quedan separadas de las columnas y las referencias al Universo Master v0.2 se ajustan a los datos realmente disponibles. Ajustes de la revisión (27-08-2026): RESTRICT consistente en las relaciones cabecera–detalle (sin CASCADE), limpieza de duplicados y numeración, y dominios de estado explícitos. Segunda revisión (28-08-2026): corrección de la referencia al Master en la sección 9 (compradores y categorías de insumo son catálogos propios), homologación con RRHH sin IDs físicos, reubicación editorial de párrafos 5-7 y dominios de estado confirmados por el equipo.</w:t>
             </w:r>
           </w:p>
         </w:tc>

</xml_diff>